<commit_message>
Generate Acta Study 8 publisher-facing binaries [skip acta-build]
</commit_message>
<xml_diff>
--- a/publication/Paper_4_Study_8/Acta_Astronautica/ACTA_ASTRONAUTICA_MANUSCRIPT.docx
+++ b/publication/Paper_4_Study_8/Acta_Astronautica/ACTA_ASTRONAUTICA_MANUSCRIPT.docx
@@ -268,6 +268,7 @@
       <w:tr>
         <w:trPr>
           <w:cantSplit/>
+          <w:tblHeader w:val="true"/>
         </w:trPr>
         <w:tc>
           <w:tcPr>
@@ -690,6 +691,7 @@
       <w:tr>
         <w:trPr>
           <w:cantSplit/>
+          <w:tblHeader w:val="true"/>
         </w:trPr>
         <w:tc>
           <w:tcPr>
@@ -1520,6 +1522,7 @@
       <w:tr>
         <w:trPr>
           <w:cantSplit/>
+          <w:tblHeader w:val="true"/>
         </w:trPr>
         <w:tc>
           <w:tcPr>
@@ -3650,6 +3653,7 @@
       <w:tr>
         <w:trPr>
           <w:cantSplit/>
+          <w:tblHeader w:val="true"/>
         </w:trPr>
         <w:tc>
           <w:tcPr>

</xml_diff>

<commit_message>
Finalize Acta Study 8 abstract and keywords [skip acta-patch]
</commit_message>
<xml_diff>
--- a/publication/Paper_4_Study_8/Acta_Astronautica/ACTA_ASTRONAUTICA_MANUSCRIPT.docx
+++ b/publication/Paper_4_Study_8/Acta_Astronautica/ACTA_ASTRONAUTICA_MANUSCRIPT.docx
@@ -67,7 +67,7 @@
         <w:keepLines w:val="0"/>
       </w:pPr>
       <w:r>
-        <w:t>Long-lived space systems must change cryptographic state without assuming continuously available connectivity. This study evaluates trusted post-compromise cryptographic transition as a deterministic finite systems problem under intermittent logical contact, not as an onboard performance benchmark. A frozen 3 x 4 x 4 x 4 x 6 x 3 factorial model crosses three exact ML-KEM/ML-DSA algorithm-pair profiles, four transition policies, four equal-total-capacity contact regimes with different temporal structures, four bounded non-cryptanalytic disruptions, six compromise phase offsets, and three logical recovery deadlines, yielding 3,456 modeled positions. The prespecified primary endpoint is trusted recovery before the deadline, summarized over the complete finite population without sampling p-values or confidence intervals. All four transition policies achieved 635/864 successful positions (73.4954%), so the prespecified contact-aware staged-minus-staged risk difference was exactly 0.000000 percentage points marginally and in every prespecified stratum. Success instead differed by standardized cryptographic-object burden: 93.7500% for ML-KEM-512/ML-DSA-44, 64.9306% for ML-KEM-768/ML-DSA-65, and 61.8056% for ML-KEM-1024/ML-DSA-87. Across all 1,152 matched non-profile positions, success was never higher for a larger frozen object bundle. Contact timing and logical deadline also changed feasibility despite equal full-cycle capacity. Policy choice primarily redistributed modeled predecessor exposure, control unavailability, dual-epoch overlap, transferred cryptographic bytes, transition attempts, and failure classification. These findings separate recovery feasibility from transition-state cost within the strict logical-contact model and do not measure spacecraft, RF, orbital, energy, or cryptographic execution performance.</w:t>
+        <w:t>Long-lived space systems must be able to change cryptographic state without assuming continuous connectivity. This study evaluates trusted post-compromise cryptographic transition as a deterministic finite systems problem under intermittent logical contact. A frozen 3 x 4 x 4 x 4 x 6 x 3 factorial model crosses three ML-KEM/ML-DSA profiles, four recovery policies, four equal-total-capacity contact regimes, four bounded non-cryptanalytic disruptions, six compromise phase offsets, and three logical deadlines, yielding 3,456 modeled positions. The primary endpoint is trusted recovery before deadline. Because the inferential object is the complete frozen population, results are reported as exact counts and proportions without sampling p-values or confidence intervals; a separately implemented same-repository reference model reproduced all 3,456 rows exactly. All four policies achieved 635/864 trusted recoveries (73.4954%), and the prespecified contact-aware staged-minus-staged risk difference was 0.000000 percentage points marginally and in every prespecified stratum. Success differed substantially by standardized cryptographic-object burden: 93.7500% for ML-KEM-512/ML-DSA-44, 64.9306% for ML-KEM-768/ML-DSA-65, and 61.8056% for ML-KEM-1024/ML-DSA-87. Success was non-increasing with object burden across all 1,152 matched non-profile positions. Contact timing and logical deadline also changed feasibility despite equal full-cycle capacity. Policy choice instead redistributed predecessor exposure, control unavailability, dual-epoch overlap, modeled transfer burden, attempts, and failure classification. In this model, contact-aware guarding does not create recovery capacity; feasibility is governed by object burden, contact structure, and deadline, while policy primarily changes security-state and availability costs.</w:t>
       </w:r>
     </w:p>
     <w:p>
@@ -78,7 +78,7 @@
         <w:t xml:space="preserve">Keywords: </w:t>
       </w:r>
       <w:r>
-        <w:t>cryptographic agility; post-quantum cryptography; ML-KEM; ML-DSA; satellite cybersecurity; space systems; post-compromise recovery; intermittent connectivity</w:t>
+        <w:t>cryptographic agility; post-quantum cryptography; ML-KEM; ML-DSA; satellite cybersecurity; intermittent connectivity</w:t>
       </w:r>
     </w:p>
     <w:p>

</xml_diff>